<commit_message>
Adjust boleto template formatting
</commit_message>
<xml_diff>
--- a/src/templates/boleto-template-contado.docx
+++ b/src/templates/boleto-template-contado.docx
@@ -97,10 +97,9 @@
           <w:color w:val="000000"/>
           <w:sz w:val="24"/>
           <w:szCs w:val="24"/>
-          <w:u w:val="single"/>
-          <w:lang w:val="es-ES_tradnl"/>
-        </w:rPr>
-        <w:t xml:space="preserve">: La parte VENDEDORA VENDE a la PARTE COMPRADORA, el siguiente inmueble de su propiedad: un LOTE ubicado en la Sección IV, en la LOCALIDAD Y PARTIDO DE MORENO, PROVINCIA DE BUENOS AIRES, con frente a la calle {calleInmueble}, entre las calles {limites}, designado según {tituloPlano}, como LOTE {lote} DE LA MANZANA {manzana}, el cual consta de las siguientes medidas, linderos y superficies: {medidas}.- NOMENCLATURA CATASTRAL: Circunscripción V, Sección F, Manzana {manzana}, Parcela {parcelaCatastral}.- PARTIDA INMOBILIARIA: 074-{partida}.- Inscripto su dominio en el Registro de la Propiedad Inmueble en la Matrícula {matricula}</w:t>
+          <w:lang w:val="es-ES_tradnl"/>
+        </w:rPr>
+        <w:t>: La parte VENDEDORA VENDE a la PARTE COMPRADORA, el siguiente inmueble de su propiedad: un LOTE ubicado en la Sección IV, en la LOCALIDAD Y PARTIDO DE MORENO, PROVINCIA DE BUENOS AIRES, con frente a la calle {calleInmueble}, entre las calles {limites}, designado según {tituloPlano}, como LOTE {lote} DE LA MANZANA {manzana}, el cual consta de las siguientes medidas, linderos y superficies: {medidas}.- NOMENCLATURA CATASTRAL: Circunscripción V, Sección F, Manzana {manzana}, Parcela {parcelaCatastral}.- PARTIDA INMOBILIARIA: 074-{partida}.- Inscripto su dominio en el Registro de la Propiedad Inmueble en la Matrícula {matricula}</w:t>
       </w:r>
     </w:p>
     <w:p>
@@ -129,19 +128,28 @@
           <w:u w:val="single"/>
           <w:lang w:val="es-ES_tradnl"/>
         </w:rPr>
+        <w:t>SEGUNDA</w:t>
+      </w:r>
+      <w:r>
+        <w:rPr>
+          <w:rFonts w:ascii="Times New Roman" w:hAnsi="Times New Roman" w:cs="Times New Roman"/>
+          <w:color w:val="000000"/>
+          <w:sz w:val="24"/>
+          <w:szCs w:val="24"/>
+          <w:lang w:val="es-ES_tradnl"/>
+        </w:rPr>
+        <w:t xml:space="preserve">: La PARTE VENDEDORA declara bajo juramento que el inmueble le corresponde por compra que realizara a CERAMICA JUAN STEFANI S.A.C.I.F.I. </w:t>
+      </w:r>
+      <w:r>
+        <w:rPr>
+          <w:rFonts w:ascii="Times New Roman" w:hAnsi="Times New Roman" w:cs="Times New Roman"/>
+          <w:color w:val="000000"/>
+          <w:sz w:val="24"/>
+          <w:szCs w:val="24"/>
+          <w:lang w:val="es-ES_tradnl"/>
+        </w:rPr>
         <w:lastRenderedPageBreak/>
-        <w:t>SEGUNDA</w:t>
-      </w:r>
-      <w:r>
-        <w:rPr>
-          <w:rFonts w:ascii="Times New Roman" w:hAnsi="Times New Roman" w:cs="Times New Roman"/>
-          <w:color w:val="000000"/>
-          <w:sz w:val="24"/>
-          <w:szCs w:val="24"/>
-          <w:u w:val="single"/>
-          <w:lang w:val="es-ES_tradnl"/>
-        </w:rPr>
-        <w:t xml:space="preserve">: La PARTE VENDEDORA declara bajo juramento que el inmueble le corresponde por compra que realizara a CERAMICA JUAN STEFANI S.A.C.I.F.I. y A., según escritura {escritura} de fecha {fechaEscritura}, pasada ante el Escribano de </w:t>
+        <w:t xml:space="preserve">y A., según escritura {escritura} de fecha {fechaEscritura}, pasada ante el Escribano de </w:t>
       </w:r>
       <w:proofErr w:type="gramStart"/>
       <w:r>
@@ -150,7 +158,6 @@
           <w:color w:val="000000"/>
           <w:sz w:val="24"/>
           <w:szCs w:val="24"/>
-          <w:u w:val="single"/>
           <w:lang w:val="es-ES_tradnl"/>
         </w:rPr>
         <w:t>ésta</w:t>
@@ -162,7 +169,6 @@
           <w:color w:val="000000"/>
           <w:sz w:val="24"/>
           <w:szCs w:val="24"/>
-          <w:u w:val="single"/>
           <w:lang w:val="es-ES_tradnl"/>
         </w:rPr>
         <w:t xml:space="preserve"> Ciudad, Sebastián E. Nadela, al folio {folio} del Registro 1.453 a su cargo, cuya Primera Copia se inscribió en el Registro de la Propiedad Inmueble de la Provincia de Buenos Aires, con fecha {fechaEscritura}, en la Matrícula {matriculaSegunda}</w:t>
@@ -202,10 +208,31 @@
           <w:color w:val="000000"/>
           <w:sz w:val="24"/>
           <w:szCs w:val="24"/>
-          <w:u w:val="single"/>
-          <w:lang w:val="es-ES_tradnl"/>
-        </w:rPr>
-        <w:t xml:space="preserve">: Esta venta se realiza por el precio total y convenido de DÓLARES ESTADOUNIDENSES BILLETE {precioTotalPalabras}, (U$S {precioTotalNum}, que la PARTE COMPRADORA abonará a la PARTE VENDEDORA de la siguiente manera: la suma de DÓLARES ESTADOUNIDENSES BILLETE {precioTotalPalabras}, (U$S {precioTotalNum},) la PARTE COMPRADORA entrega la PARTE VENDEDORA en este acto, no quedando deudas de precio por delante, el pago se realiza  en billetes de dicha moneda, queda aclarado que en los plazos mencionados más adelante se celebrara la escritura traslativa de dominio, en el lugar a designar por la PARTE COMPRADORA dentro del radio de la Ciudad Autónoma de Buenos Aires.- Ambas partes manifiestan que otorgan plena validez al pago que se efectúan mediante el presente y expresan que no tienen reclamo que formularse y renuncian a invocar las acciones establecidas en los artículos 1083 a 1088 del Código Civil y Comercial de la Nación respecto al pacto comisorio, como así también renuncian a cualquier acción que les pudiera corresponder por incumplimiento de la ley 25.345. Las partes renuncian a la facultad de arrepentimiento prevista por el artículo 1059 del mencionado Código.- </w:t>
+          <w:lang w:val="es-ES_tradnl"/>
+        </w:rPr>
+        <w:t xml:space="preserve">: Esta venta se realiza por el precio total y convenido de DÓLARES ESTADOUNIDENSES BILLETE {precioTotalPalabras}, (U$S {precioTotalNum}, que la PARTE COMPRADORA abonará a la PARTE VENDEDORA de la siguiente manera: la suma de DÓLARES ESTADOUNIDENSES BILLETE {precioTotalPalabras}, (U$S {precioTotalNum},) la PARTE COMPRADORA entrega la PARTE VENDEDORA en este acto, no quedando deudas de precio por delante, el pago se realiza  en billetes de dicha moneda, queda aclarado que en los plazos mencionados más adelante se celebrara la escritura traslativa de dominio, en el lugar a designar por la PARTE COMPRADORA dentro del radio de la Ciudad Autónoma de Buenos Aires.- Ambas partes manifiestan que otorgan plena validez al pago que se efectúan mediante el presente y expresan que no tienen reclamo que formularse y renuncian a invocar las acciones establecidas en los artículos 1083 a 1088 del Código Civil y Comercial de la Nación respecto al pacto comisorio, como así también renuncian a cualquier acción que les pudiera corresponder por incumplimiento de la ley 25.345. Las partes renuncian a la facultad de arrepentimiento prevista por el artículo 1059 del mencionado </w:t>
+      </w:r>
+      <w:proofErr w:type="gramStart"/>
+      <w:r>
+        <w:rPr>
+          <w:rFonts w:ascii="Times New Roman" w:hAnsi="Times New Roman" w:cs="Times New Roman"/>
+          <w:color w:val="000000"/>
+          <w:sz w:val="24"/>
+          <w:szCs w:val="24"/>
+          <w:lang w:val="es-ES_tradnl"/>
+        </w:rPr>
+        <w:t>Código.-</w:t>
+      </w:r>
+      <w:proofErr w:type="gramEnd"/>
+      <w:r>
+        <w:rPr>
+          <w:rFonts w:ascii="Times New Roman" w:hAnsi="Times New Roman" w:cs="Times New Roman"/>
+          <w:color w:val="000000"/>
+          <w:sz w:val="24"/>
+          <w:szCs w:val="24"/>
+          <w:lang w:val="es-ES_tradnl"/>
+        </w:rPr>
+        <w:t xml:space="preserve"> </w:t>
       </w:r>
     </w:p>
     <w:p>
@@ -256,7 +283,7 @@
           <w:szCs w:val="24"/>
           <w:lang w:val="es-ES_tradnl"/>
         </w:rPr>
-        <w:t xml:space="preserve">Las partes acuerdan que el precio se ha convenido en dólares estadounidenses billetes, como moneda de contrato, en los términos del artículo 766 del Código Civil y Comercial de la Nación. Ambas partes renuncian a lo estatuido en el artículo 765 del mismo ordenamiento legal, de acuerdo a lo establecido en el </w:t>
+        <w:t xml:space="preserve">Las partes acuerdan que el precio se ha convenido en dólares estadounidenses billetes, como moneda de contrato, en los términos del artículo 766 del Código Civil y Comercial de la Nación. Ambas partes renuncian a lo estatuido en el artículo 765 del mismo ordenamiento legal, de acuerdo a lo establecido en el artículo 13 ya que los efectos de la ley pueden ser renunciados en el caso particular por no estar prohibido por el ordenamiento jurídico. Por tratarse de una obligación de </w:t>
       </w:r>
       <w:r>
         <w:rPr>
@@ -267,7 +294,7 @@
           <w:lang w:val="es-ES_tradnl"/>
         </w:rPr>
         <w:lastRenderedPageBreak/>
-        <w:t xml:space="preserve">artículo 13 ya que los efectos de la ley pueden ser renunciados en el caso particular por no estar prohibido por el ordenamiento jurídico. Por tratarse de una obligación de género se establece que la elección queda en cabeza de </w:t>
+        <w:t xml:space="preserve">género se establece que la elección queda en cabeza de </w:t>
       </w:r>
       <w:r>
         <w:rPr>
@@ -618,7 +645,7 @@
           <w:u w:val="single"/>
           <w:lang w:val="es-ES_tradnl"/>
         </w:rPr>
-        <w:t xml:space="preserve">: La escritura traslativa del dominio, se llevará a cabo a más tardar en un plazo no mayor a CIENTO OCHENTA DÍAS (180) días contados desde la fecha de firma del presente boleto, por ante el Escribano Sebastián Ezequiel Nadela, con oficinas en la calle Hipólito Yrigoyen 850, piso 3, oficina 332, de esta Ciudad, Titular del Registro Notarial Nº 1453, teléfonos 4334-1482, email </w:t>
+        <w:t xml:space="preserve">: La escritura traslativa del dominio, se llevará a cabo a más tardar en un plazo no mayor a CIENTO OCHENTA DÍAS (180) días contados desde la fecha de firma del presente boleto, por ante el Escribano Sebastián Ezequiel Nadela, con oficinas en la calle Hipólito Yrigoyen 850, piso 3, oficina 332, de esta Ciudad, Titular del Registro Notarial Nº 1453, teléfonos 4334-1482, email sebastian@escribanianadela.com.ar / ap@escribanianadela.com.ar a quien las partes facultan para hacer las citaciones y emplazamientos de Acto Notarial. La fecha </w:t>
       </w:r>
       <w:r>
         <w:rPr>
@@ -630,7 +657,7 @@
           <w:lang w:val="es-ES_tradnl"/>
         </w:rPr>
         <w:lastRenderedPageBreak/>
-        <w:t xml:space="preserve">sebastian@escribanianadela.com.ar / ap@escribanianadela.com.ar a quien las partes facultan para hacer las citaciones y emplazamientos de Acto Notarial. La fecha máxima de escrituración prevista podrá prorrogarse </w:t>
+        <w:t xml:space="preserve">máxima de escrituración prevista podrá prorrogarse </w:t>
       </w:r>
       <w:proofErr w:type="gramStart"/>
       <w:r>
@@ -969,7 +996,7 @@
           <w:szCs w:val="24"/>
           <w:lang w:val="es-ES_tradnl"/>
         </w:rPr>
-        <w:t xml:space="preserve">, automáticamente, por el solo transcurso del tiempo, de pleno derecho y sin necesidad de interpelación ni trámite alguno, judicial </w:t>
+        <w:t xml:space="preserve">, automáticamente, por el solo transcurso del tiempo, de pleno derecho y sin necesidad de interpelación ni trámite alguno, judicial o extrajudicial, hasta el efectivo cumplimiento de LA PARTE VENDEDORA, el monto así determinado podrá ser deducido del saldo de precio o reclamarse </w:t>
       </w:r>
       <w:r>
         <w:rPr>
@@ -979,7 +1006,7 @@
           <w:lang w:val="es-ES_tradnl"/>
         </w:rPr>
         <w:lastRenderedPageBreak/>
-        <w:t xml:space="preserve">o extrajudicial, hasta el efectivo cumplimiento de LA PARTE VENDEDORA, el monto así determinado podrá ser deducido del saldo de precio o reclamarse judicialmente por la vía ejecutiva, teniéndose presente que el pago de la pena, cualquiera fuese su monto, no extinguirá el derecho de </w:t>
+        <w:t xml:space="preserve">judicialmente por la vía ejecutiva, teniéndose presente que el pago de la pena, cualquiera fuese su monto, no extinguirá el derecho de </w:t>
       </w:r>
       <w:r>
         <w:rPr>
@@ -1298,8 +1325,17 @@
           <w:szCs w:val="24"/>
           <w:lang w:val="es-ES_tradnl"/>
         </w:rPr>
+        <w:t xml:space="preserve">Las partes se someten a los Tribunales en lo Civil de la Justicia Ordinaria de la Capital Federal, Ciudad Autónoma de Buenos Aires, renunciando a todo otro fuero o </w:t>
+      </w:r>
+      <w:r>
+        <w:rPr>
+          <w:rFonts w:ascii="Times New Roman" w:hAnsi="Times New Roman" w:cs="Times New Roman"/>
+          <w:sz w:val="24"/>
+          <w:szCs w:val="24"/>
+          <w:lang w:val="es-ES_tradnl"/>
+        </w:rPr>
         <w:lastRenderedPageBreak/>
-        <w:t xml:space="preserve">Las partes se someten a los Tribunales en lo Civil de la Justicia Ordinaria de la Capital Federal, Ciudad Autónoma de Buenos Aires, renunciando a todo otro fuero o jurisdicción que pudiera corresponder, constituyendo domicilio especial en los indicados al comienzo de la presente, donde serán válidas todas las notificaciones, citaciones y emplazamientos que fueren menester realizar.- </w:t>
+        <w:t xml:space="preserve">jurisdicción que pudiera corresponder, constituyendo domicilio especial en los indicados al comienzo de la presente, donde serán válidas todas las notificaciones, citaciones y emplazamientos que fueren menester realizar.- </w:t>
       </w:r>
     </w:p>
     <w:p>

</xml_diff>

<commit_message>
Add complete co-buyer data to boletos
</commit_message>
<xml_diff>
--- a/src/templates/boleto-template-contado.docx
+++ b/src/templates/boleto-template-contado.docx
@@ -36,6 +36,7 @@
     </w:p>
     <w:p>
       <w:pPr>
+        <w:widowControl w:val="0"/>
         <w:autoSpaceDE w:val="0"/>
         <w:autoSpaceDN w:val="0"/>
         <w:adjustRightInd w:val="0"/>
@@ -57,7 +58,7 @@
           <w:szCs w:val="24"/>
           <w:lang w:val="es-ES_tradnl"/>
         </w:rPr>
-        <w:t xml:space="preserve">En la Ciudad Autónoma de Buenos Aires, a los {dia} días del mes de {mes} de {anioLetras}, quienes suscriben, por una parte: 1) MIGUEL ÁNGEL LÁZZARO, argentino, titular del Documento Nacional de Identidad 8.206.039 y del CUIL 20-08206039-2, domiciliado en la calle Ladislao Martínez 243 Piso 2, Localidad de Martínez, Partido de San Isidro, Provincia de Buenos Aires, quien interviene en nombre y representación, en su carácter de Presidente de la Sociedad que gira en esta plaza, bajo la denominación de “BARRIO STEFANI SOCIEDAD ANÓNIMA”, CUIT 30-71917882-7, con sede social en la calle Talcahuano 469, Piso 2, de ésta Ciudad, en adelante denominado “Parte Vendedora"; y por la otra parte: 2) {nombreComprador}, {nacionalidad}, nacido el {fechaNacimientoLetras}, {estadoCivil}, titular del Documento Nacional de Identidad {dniComprador}, CUIT {cuitComprador}, domiciliado en {domicilioComprador}, en adelante denominado "Parte Compradora", y conjuntamente denominadas "Las Partes"; han convenido en celebrar el presente BOLETO DE COMPRA-VENTA INMOBILIARIA, sujeto a las siguientes cláusulas y condiciones: </w:t>
+        <w:t>En la Ciudad Autónoma de Buenos Aires, a los {dia} días del mes de {mes} de {anioLetras}, quienes suscriben, por una parte: 1) MIGUEL ÁNGEL LÁZZARO, argentino, titular del Documento Nacional de Identidad 8.206.039 y del CUIL 20-08206039-2, domiciliado en la calle Ladislao Martínez 243 Piso 2, Localidad de Martínez, Partido de San Isidro, Provincia de Buenos Aires, quien interviene en nombre y representación, en su carácter de Presidente de la Sociedad que gira en esta plaza, bajo la denominación de “BARRIO STEFANI SOCIEDAD ANÓNIMA”, CUIT 30-71917882-7, con sede social en la calle Talcahuano 469, Piso 2, de ésta Ciudad, en adelante denominado “Parte Vendedora"; y por la otra parte: 2) {nombreComprador}, {nacionalidad}, nacido el {fechaNacimientoLetras}, {estadoCivil}, titular del Documento Nacional de Identidad {dniComprador}, CUIT {cuitComprador}, domiciliado en {domicilioComprador}{#coCompradorIntro}; y {nombreCoComprador}, {nacionalidadCoComprador}, nacido el {fechaNacimientoCoCompradorLetras}, {estadoCivilCoComprador}, titular del Documento Nacional de Identidad {dniCoComprador}, CUIT {cuitCoComprador}, domiciliado en {domicilioCoComprador}{/coCompradorIntro}, en adelante "Parte Compradora", y conjuntamente denominadas "Las Partes"; han convenido en celebrar el presente BOLETO DE COMPRA-VENTA INMOBILIARIA, sujeto a las siguientes cláusulas y condiciones:</w:t>
       </w:r>
     </w:p>
     <w:p>
@@ -99,7 +100,18 @@
           <w:szCs w:val="24"/>
           <w:lang w:val="es-ES_tradnl"/>
         </w:rPr>
-        <w:t>: La parte VENDEDORA VENDE a la PARTE COMPRADORA, el siguiente inmueble de su propiedad: un LOTE ubicado en la Sección IV, en la LOCALIDAD Y PARTIDO DE MORENO, PROVINCIA DE BUENOS AIRES, con frente a la calle {calleInmueble}, entre las calles {limites}, designado según {tituloPlano}, como LOTE {lote} DE LA MANZANA {manzana}, el cual consta de las siguientes medidas, linderos y superficies: {medidas}.- NOMENCLATURA CATASTRAL: Circunscripción V, Sección F, Manzana {manzana}, Parcela {parcelaCatastral}.- PARTIDA INMOBILIARIA: 074-{partida}.- Inscripto su dominio en el Registro de la Propiedad Inmueble en la Matrícula {matricula}</w:t>
+        <w:t xml:space="preserve">: La parte VENDEDORA VENDE a la PARTE COMPRADORA, el siguiente inmueble de su propiedad: un LOTE ubicado en la Sección IV, en la LOCALIDAD Y PARTIDO DE MORENO, PROVINCIA DE BUENOS AIRES, con frente a la calle {calleInmueble}, entre las calles {limites}, designado según {tituloPlano}, como LOTE {lote} DE LA MANZANA {manzana}, el cual consta de las siguientes medidas, linderos y superficies: {medidas}.- NOMENCLATURA CATASTRAL: Circunscripción V, Sección F, Manzana {manzana}, Parcela </w:t>
+      </w:r>
+      <w:r>
+        <w:rPr>
+          <w:rFonts w:ascii="Times New Roman" w:hAnsi="Times New Roman" w:cs="Times New Roman"/>
+          <w:color w:val="000000"/>
+          <w:sz w:val="24"/>
+          <w:szCs w:val="24"/>
+          <w:lang w:val="es-ES_tradnl"/>
+        </w:rPr>
+        <w:lastRenderedPageBreak/>
+        <w:t>{parcelaCatastral}.- PARTIDA INMOBILIARIA: 074-{partida}.- Inscripto su dominio en el Registro de la Propiedad Inmueble en la Matrícula {matricula}</w:t>
       </w:r>
     </w:p>
     <w:p>
@@ -138,40 +150,7 @@
           <w:szCs w:val="24"/>
           <w:lang w:val="es-ES_tradnl"/>
         </w:rPr>
-        <w:t xml:space="preserve">: La PARTE VENDEDORA declara bajo juramento que el inmueble le corresponde por compra que realizara a CERAMICA JUAN STEFANI S.A.C.I.F.I. </w:t>
-      </w:r>
-      <w:r>
-        <w:rPr>
-          <w:rFonts w:ascii="Times New Roman" w:hAnsi="Times New Roman" w:cs="Times New Roman"/>
-          <w:color w:val="000000"/>
-          <w:sz w:val="24"/>
-          <w:szCs w:val="24"/>
-          <w:lang w:val="es-ES_tradnl"/>
-        </w:rPr>
-        <w:lastRenderedPageBreak/>
-        <w:t xml:space="preserve">y A., según escritura {escritura} de fecha {fechaEscritura}, pasada ante el Escribano de </w:t>
-      </w:r>
-      <w:proofErr w:type="gramStart"/>
-      <w:r>
-        <w:rPr>
-          <w:rFonts w:ascii="Times New Roman" w:hAnsi="Times New Roman" w:cs="Times New Roman"/>
-          <w:color w:val="000000"/>
-          <w:sz w:val="24"/>
-          <w:szCs w:val="24"/>
-          <w:lang w:val="es-ES_tradnl"/>
-        </w:rPr>
-        <w:t>ésta</w:t>
-      </w:r>
-      <w:proofErr w:type="gramEnd"/>
-      <w:r>
-        <w:rPr>
-          <w:rFonts w:ascii="Times New Roman" w:hAnsi="Times New Roman" w:cs="Times New Roman"/>
-          <w:color w:val="000000"/>
-          <w:sz w:val="24"/>
-          <w:szCs w:val="24"/>
-          <w:lang w:val="es-ES_tradnl"/>
-        </w:rPr>
-        <w:t xml:space="preserve"> Ciudad, Sebastián E. Nadela, al folio {folio} del Registro 1.453 a su cargo, cuya Primera Copia se inscribió en el Registro de la Propiedad Inmueble de la Provincia de Buenos Aires, con fecha {fechaEscritura}, en la Matrícula {matriculaSegunda}</w:t>
+        <w:t>: La PARTE VENDEDORA declara bajo juramento que el inmueble le corresponde por compra que realizara a CERAMICA JUAN STEFANI S.A.C.I.F.I. y A., según escritura {escritura} de fecha {fechaEscritura}, pasada ante el Escribano de ésta Ciudad, Sebastián E. Nadela, al folio {folio} del Registro 1.453 a su cargo, cuya Primera Copia se inscribió en el Registro de la Propiedad Inmueble de la Provincia de Buenos Aires, con fecha {fechaEscritura}, en la Matrícula {matriculaSegunda}</w:t>
       </w:r>
     </w:p>
     <w:p>
@@ -210,29 +189,7 @@
           <w:szCs w:val="24"/>
           <w:lang w:val="es-ES_tradnl"/>
         </w:rPr>
-        <w:t xml:space="preserve">: Esta venta se realiza por el precio total y convenido de DÓLARES ESTADOUNIDENSES BILLETE {precioTotalPalabras}, (U$S {precioTotalNum}, que la PARTE COMPRADORA abonará a la PARTE VENDEDORA de la siguiente manera: la suma de DÓLARES ESTADOUNIDENSES BILLETE {precioTotalPalabras}, (U$S {precioTotalNum},) la PARTE COMPRADORA entrega la PARTE VENDEDORA en este acto, no quedando deudas de precio por delante, el pago se realiza  en billetes de dicha moneda, queda aclarado que en los plazos mencionados más adelante se celebrara la escritura traslativa de dominio, en el lugar a designar por la PARTE COMPRADORA dentro del radio de la Ciudad Autónoma de Buenos Aires.- Ambas partes manifiestan que otorgan plena validez al pago que se efectúan mediante el presente y expresan que no tienen reclamo que formularse y renuncian a invocar las acciones establecidas en los artículos 1083 a 1088 del Código Civil y Comercial de la Nación respecto al pacto comisorio, como así también renuncian a cualquier acción que les pudiera corresponder por incumplimiento de la ley 25.345. Las partes renuncian a la facultad de arrepentimiento prevista por el artículo 1059 del mencionado </w:t>
-      </w:r>
-      <w:proofErr w:type="gramStart"/>
-      <w:r>
-        <w:rPr>
-          <w:rFonts w:ascii="Times New Roman" w:hAnsi="Times New Roman" w:cs="Times New Roman"/>
-          <w:color w:val="000000"/>
-          <w:sz w:val="24"/>
-          <w:szCs w:val="24"/>
-          <w:lang w:val="es-ES_tradnl"/>
-        </w:rPr>
-        <w:t>Código.-</w:t>
-      </w:r>
-      <w:proofErr w:type="gramEnd"/>
-      <w:r>
-        <w:rPr>
-          <w:rFonts w:ascii="Times New Roman" w:hAnsi="Times New Roman" w:cs="Times New Roman"/>
-          <w:color w:val="000000"/>
-          <w:sz w:val="24"/>
-          <w:szCs w:val="24"/>
-          <w:lang w:val="es-ES_tradnl"/>
-        </w:rPr>
-        <w:t xml:space="preserve"> </w:t>
+        <w:t xml:space="preserve">: Esta venta se realiza por el precio total y convenido de DÓLARES ESTADOUNIDENSES BILLETE {precioTotalPalabras}, (U$S {precioTotalNum}, que la PARTE COMPRADORA abonará a la PARTE VENDEDORA de la siguiente manera: la suma de DÓLARES ESTADOUNIDENSES BILLETE {precioTotalPalabras}, (U$S {precioTotalNum},) la PARTE COMPRADORA entrega la PARTE VENDEDORA en este acto, no quedando deudas de precio por delante, el pago se realiza  en billetes de dicha moneda, queda aclarado que en los plazos mencionados más adelante se celebrara la escritura traslativa de dominio, en el lugar a designar por la PARTE COMPRADORA dentro del radio de la Ciudad Autónoma de Buenos Aires.- Ambas partes manifiestan que otorgan plena validez al pago que se efectúan mediante el presente y expresan que no tienen reclamo que formularse y renuncian a invocar las acciones establecidas en los artículos 1083 a 1088 del Código Civil y Comercial de la Nación respecto al pacto comisorio, como así también renuncian a cualquier acción que les pudiera corresponder por incumplimiento de la ley 25.345. Las partes renuncian a la facultad de arrepentimiento prevista por el artículo 1059 del mencionado Código.- </w:t>
       </w:r>
     </w:p>
     <w:p>
@@ -283,7 +240,7 @@
           <w:szCs w:val="24"/>
           <w:lang w:val="es-ES_tradnl"/>
         </w:rPr>
-        <w:t xml:space="preserve">Las partes acuerdan que el precio se ha convenido en dólares estadounidenses billetes, como moneda de contrato, en los términos del artículo 766 del Código Civil y Comercial de la Nación. Ambas partes renuncian a lo estatuido en el artículo 765 del mismo ordenamiento legal, de acuerdo a lo establecido en el artículo 13 ya que los efectos de la ley pueden ser renunciados en el caso particular por no estar prohibido por el ordenamiento jurídico. Por tratarse de una obligación de </w:t>
+        <w:t xml:space="preserve">Las partes acuerdan que el precio se ha convenido en dólares estadounidenses billetes, como moneda de contrato, en los términos del artículo 766 </w:t>
       </w:r>
       <w:r>
         <w:rPr>
@@ -294,7 +251,7 @@
           <w:lang w:val="es-ES_tradnl"/>
         </w:rPr>
         <w:lastRenderedPageBreak/>
-        <w:t xml:space="preserve">género se establece que la elección queda en cabeza de </w:t>
+        <w:t xml:space="preserve">del Código Civil y Comercial de la Nación. Ambas partes renuncian a lo estatuido en el artículo 765 del mismo ordenamiento legal, de acuerdo a lo establecido en el artículo 13 ya que los efectos de la ley pueden ser renunciados en el caso particular por no estar prohibido por el ordenamiento jurídico. Por tratarse de una obligación de género se establece que la elección queda en cabeza de </w:t>
       </w:r>
       <w:r>
         <w:rPr>
@@ -645,7 +602,7 @@
           <w:u w:val="single"/>
           <w:lang w:val="es-ES_tradnl"/>
         </w:rPr>
-        <w:t xml:space="preserve">: La escritura traslativa del dominio, se llevará a cabo a más tardar en un plazo no mayor a CIENTO OCHENTA DÍAS (180) días contados desde la fecha de firma del presente boleto, por ante el Escribano Sebastián Ezequiel Nadela, con oficinas en la calle Hipólito Yrigoyen 850, piso 3, oficina 332, de esta Ciudad, Titular del Registro Notarial Nº 1453, teléfonos 4334-1482, email sebastian@escribanianadela.com.ar / ap@escribanianadela.com.ar a quien las partes facultan para hacer las citaciones y emplazamientos de Acto Notarial. La fecha </w:t>
+        <w:t xml:space="preserve">: La escritura traslativa del dominio, se llevará a cabo a más tardar en un plazo no mayor a CIENTO OCHENTA DÍAS (180) días contados desde la fecha de firma del presente boleto, por ante el Escribano Sebastián Ezequiel Nadela, con </w:t>
       </w:r>
       <w:r>
         <w:rPr>
@@ -657,31 +614,7 @@
           <w:lang w:val="es-ES_tradnl"/>
         </w:rPr>
         <w:lastRenderedPageBreak/>
-        <w:t xml:space="preserve">máxima de escrituración prevista podrá prorrogarse </w:t>
-      </w:r>
-      <w:proofErr w:type="gramStart"/>
-      <w:r>
-        <w:rPr>
-          <w:rFonts w:ascii="Times New Roman" w:hAnsi="Times New Roman" w:cs="Times New Roman"/>
-          <w:color w:val="000000"/>
-          <w:sz w:val="24"/>
-          <w:szCs w:val="24"/>
-          <w:u w:val="single"/>
-          <w:lang w:val="es-ES_tradnl"/>
-        </w:rPr>
-        <w:t>en caso que</w:t>
-      </w:r>
-      <w:proofErr w:type="gramEnd"/>
-      <w:r>
-        <w:rPr>
-          <w:rFonts w:ascii="Times New Roman" w:hAnsi="Times New Roman" w:cs="Times New Roman"/>
-          <w:color w:val="000000"/>
-          <w:sz w:val="24"/>
-          <w:szCs w:val="24"/>
-          <w:u w:val="single"/>
-          <w:lang w:val="es-ES_tradnl"/>
-        </w:rPr>
-        <w:t xml:space="preserve"> el trámite a realizar en el expediente sucesorio sufriera demoras por causas ajenas a la diligencia de la parte vendedora. Las partes asimismo se obligan a hacer entrega de la documentación correspondiente, como ser títulos originales. El pago de tasas, De corresponder, el impuesto a las ganancias, sellados, impuestos y demás erogaciones emergentes de la escritura traslativa de dominio serán soportados en su totalidad por la PARTE COMPRADORA, incluyendo el pago del impuesto de sellos que pudiera corresponder. </w:t>
+        <w:t xml:space="preserve">oficinas en la calle Hipólito Yrigoyen 850, piso 3, oficina 332, de esta Ciudad, Titular del Registro Notarial Nº 1453, teléfonos 4334-1482, email sebastian@escribanianadela.com.ar / ap@escribanianadela.com.ar a quien las partes facultan para hacer las citaciones y emplazamientos de Acto Notarial. La fecha máxima de escrituración prevista podrá prorrogarse en caso que el trámite a realizar en el expediente sucesorio sufriera demoras por causas ajenas a la diligencia de la parte vendedora. Las partes asimismo se obligan a hacer entrega de la documentación correspondiente, como ser títulos originales. El pago de tasas, De corresponder, el impuesto a las ganancias, sellados, impuestos y demás erogaciones emergentes de la escritura traslativa de dominio serán soportados en su totalidad por la PARTE COMPRADORA, incluyendo el pago del impuesto de sellos que pudiera corresponder. </w:t>
       </w:r>
     </w:p>
     <w:p>
@@ -967,7 +900,17 @@
           <w:szCs w:val="24"/>
           <w:lang w:val="es-ES_tradnl"/>
         </w:rPr>
-        <w:t xml:space="preserve"> podrá optar por: A) Exigir su total cumplimiento más el pago de una multa diaria de Dólares Estadounidenses Doscientos (U$S 200), sea día hábil o inhábil, en concepto de cláusula penal por el retardo, la que se devengará en favor de </w:t>
+        <w:t xml:space="preserve"> podrá optar por: A) Exigir su total cumplimiento más el pago de una multa diaria de Dólares Estadounidenses Doscientos (U$S 200), sea día hábil o inhábil, en concepto de cláusula penal por el retardo, la que se devengará en </w:t>
+      </w:r>
+      <w:r>
+        <w:rPr>
+          <w:rFonts w:ascii="Times New Roman" w:hAnsi="Times New Roman" w:cs="Times New Roman"/>
+          <w:sz w:val="24"/>
+          <w:szCs w:val="24"/>
+          <w:lang w:val="es-ES_tradnl"/>
+        </w:rPr>
+        <w:lastRenderedPageBreak/>
+        <w:t xml:space="preserve">favor de </w:t>
       </w:r>
       <w:r>
         <w:rPr>
@@ -996,17 +939,7 @@
           <w:szCs w:val="24"/>
           <w:lang w:val="es-ES_tradnl"/>
         </w:rPr>
-        <w:t xml:space="preserve">, automáticamente, por el solo transcurso del tiempo, de pleno derecho y sin necesidad de interpelación ni trámite alguno, judicial o extrajudicial, hasta el efectivo cumplimiento de LA PARTE VENDEDORA, el monto así determinado podrá ser deducido del saldo de precio o reclamarse </w:t>
-      </w:r>
-      <w:r>
-        <w:rPr>
-          <w:rFonts w:ascii="Times New Roman" w:hAnsi="Times New Roman" w:cs="Times New Roman"/>
-          <w:sz w:val="24"/>
-          <w:szCs w:val="24"/>
-          <w:lang w:val="es-ES_tradnl"/>
-        </w:rPr>
-        <w:lastRenderedPageBreak/>
-        <w:t xml:space="preserve">judicialmente por la vía ejecutiva, teniéndose presente que el pago de la pena, cualquiera fuese su monto, no extinguirá el derecho de </w:t>
+        <w:t xml:space="preserve">, automáticamente, por el solo transcurso del tiempo, de pleno derecho y sin necesidad de interpelación ni trámite alguno, judicial o extrajudicial, hasta el efectivo cumplimiento de LA PARTE VENDEDORA, el monto así determinado podrá ser deducido del saldo de precio o reclamarse judicialmente por la vía ejecutiva, teniéndose presente que el pago de la pena, cualquiera fuese su monto, no extinguirá el derecho de </w:t>
       </w:r>
       <w:r>
         <w:rPr>
@@ -1227,6 +1160,7 @@
           <w:u w:val="single"/>
           <w:lang w:val="es-ES_tradnl"/>
         </w:rPr>
+        <w:lastRenderedPageBreak/>
         <w:t>NOVENA</w:t>
       </w:r>
       <w:r>
@@ -1325,17 +1259,7 @@
           <w:szCs w:val="24"/>
           <w:lang w:val="es-ES_tradnl"/>
         </w:rPr>
-        <w:t xml:space="preserve">Las partes se someten a los Tribunales en lo Civil de la Justicia Ordinaria de la Capital Federal, Ciudad Autónoma de Buenos Aires, renunciando a todo otro fuero o </w:t>
-      </w:r>
-      <w:r>
-        <w:rPr>
-          <w:rFonts w:ascii="Times New Roman" w:hAnsi="Times New Roman" w:cs="Times New Roman"/>
-          <w:sz w:val="24"/>
-          <w:szCs w:val="24"/>
-          <w:lang w:val="es-ES_tradnl"/>
-        </w:rPr>
-        <w:lastRenderedPageBreak/>
-        <w:t xml:space="preserve">jurisdicción que pudiera corresponder, constituyendo domicilio especial en los indicados al comienzo de la presente, donde serán válidas todas las notificaciones, citaciones y emplazamientos que fueren menester realizar.- </w:t>
+        <w:t xml:space="preserve">Las partes se someten a los Tribunales en lo Civil de la Justicia Ordinaria de la Capital Federal, Ciudad Autónoma de Buenos Aires, renunciando a todo otro fuero o jurisdicción que pudiera corresponder, constituyendo domicilio especial en los indicados al comienzo de la presente, donde serán válidas todas las notificaciones, citaciones y emplazamientos que fueren menester realizar.- </w:t>
       </w:r>
     </w:p>
     <w:p>

</xml_diff>